<commit_message>
Replace baseline H_ph with exact paper H_MUTC (eta-weighted)
Adopts the full MUTC photocurrent transfer function from the paper, fixing
the simplified form's defects: the depleted-absorber in-situ electron now
carries its collector-crossing term (W_C) and uniform-generation triangular
transit, weighted by generation fractions eta_U/eta_D (Beer-Lambert,
back-side illumination: eta_U=0.708, eta_D=0.292) instead of raw widths.
Each region a carrier crosses gets its own term; DC normalizes to 1 exactly.

Applied to both UTC_PD_final.py (-7 V) and UTC_PD_5V.py (-5 V); H_ph is
bias-independent so only Cj differs between them. S11 fits unchanged.
Transit-limited f_tr 30.46 -> 31.53 GHz. Equations doc and Origin exports
regenerated.

Co-Authored-By: Claude Opus 4.8 <noreply@anthropic.com>
Claude-Session: https://claude.ai/code/session_01Ai2cJaAR1a4hKpeYKcLV7K
</commit_message>
<xml_diff>
--- a/UTC_PD_equations.docx
+++ b/UTC_PD_equations.docx
@@ -11,13 +11,13 @@
         <w:t xml:space="preserve">UTC-PD Model Equations (Baseline)</w:t>
       </w:r>
     </w:p>
-    <w:bookmarkStart w:id="9" w:name="Xe75e9927d549424e40ec331c6f94abc8fefceb7"/>
+    <w:bookmarkStart w:id="9" w:name="X71cd759dfb70eeeceb8c2216dd2b56a1a81048f"/>
     <w:p>
       <w:pPr>
         <w:pStyle w:val="Heading2"/>
       </w:pPr>
       <w:r>
-        <w:t xml:space="preserve">1. Photocurrent transfer function — rigorous Ramo</w:t>
+        <w:t xml:space="preserve">1. Photocurrent transfer function — MUTC model</w:t>
       </w:r>
       <w:r>
         <w:t xml:space="preserve"> </w:t>
@@ -26,7 +26,7 @@
         <m:sSub>
           <m:e>
             <m:r>
-              <m:t>J</m:t>
+              <m:t>H</m:t>
             </m:r>
           </m:e>
           <m:sub>
@@ -34,29 +34,44 @@
               <m:rPr>
                 <m:sty m:val="p"/>
               </m:rPr>
-              <m:t>t</m:t>
+              <m:t>M</m:t>
             </m:r>
             <m:r>
               <m:rPr>
                 <m:sty m:val="p"/>
               </m:rPr>
-              <m:t>o</m:t>
+              <m:t>U</m:t>
             </m:r>
             <m:r>
               <m:rPr>
                 <m:sty m:val="p"/>
               </m:rPr>
-              <m:t>t</m:t>
+              <m:t>T</m:t>
+            </m:r>
+            <m:r>
+              <m:rPr>
+                <m:sty m:val="p"/>
+              </m:rPr>
+              <m:t>C</m:t>
             </m:r>
           </m:sub>
         </m:sSub>
+        <m:r>
+          <m:rPr>
+            <m:sty m:val="p"/>
+          </m:rPr>
+          <m:t>(</m:t>
+        </m:r>
+        <m:r>
+          <m:t>ω</m:t>
+        </m:r>
+        <m:r>
+          <m:rPr>
+            <m:sty m:val="p"/>
+          </m:rPr>
+          <m:t>)</m:t>
+        </m:r>
       </m:oMath>
-      <w:r>
-        <w:t xml:space="preserve"> </w:t>
-      </w:r>
-      <w:r>
-        <w:t xml:space="preserve">integral</w:t>
-      </w:r>
     </w:p>
     <w:p>
       <w:pPr>
@@ -78,13 +93,25 @@
                 <m:rPr>
                   <m:sty m:val="p"/>
                 </m:rPr>
-                <m:t>p</m:t>
-              </m:r>
-              <m:r>
-                <m:rPr>
-                  <m:sty m:val="p"/>
-                </m:rPr>
-                <m:t>h</m:t>
+                <m:t>M</m:t>
+              </m:r>
+              <m:r>
+                <m:rPr>
+                  <m:sty m:val="p"/>
+                </m:rPr>
+                <m:t>U</m:t>
+              </m:r>
+              <m:r>
+                <m:rPr>
+                  <m:sty m:val="p"/>
+                </m:rPr>
+                <m:t>T</m:t>
+              </m:r>
+              <m:r>
+                <m:rPr>
+                  <m:sty m:val="p"/>
+                </m:rPr>
+                <m:t>C</m:t>
               </m:r>
             </m:sub>
           </m:sSub>
@@ -114,9 +141,18 @@
               <m:type m:val="bar"/>
             </m:fPr>
             <m:num>
-              <m:r>
-                <m:t>1</m:t>
-              </m:r>
+              <m:sSub>
+                <m:e>
+                  <m:r>
+                    <m:t>η</m:t>
+                  </m:r>
+                </m:e>
+                <m:sub>
+                  <m:r>
+                    <m:t>U</m:t>
+                  </m:r>
+                </m:sub>
+              </m:sSub>
             </m:num>
             <m:den>
               <m:sSub>
@@ -127,31 +163,49 @@
                 </m:e>
                 <m:sub>
                   <m:r>
-                    <m:rPr>
-                      <m:sty m:val="p"/>
-                    </m:rPr>
-                    <m:t>n</m:t>
-                  </m:r>
-                  <m:r>
-                    <m:rPr>
-                      <m:sty m:val="p"/>
-                    </m:rPr>
-                    <m:t>o</m:t>
-                  </m:r>
-                  <m:r>
-                    <m:rPr>
-                      <m:sty m:val="p"/>
-                    </m:rPr>
-                    <m:t>r</m:t>
-                  </m:r>
-                  <m:r>
-                    <m:rPr>
-                      <m:sty m:val="p"/>
-                    </m:rPr>
-                    <m:t>m</m:t>
+                    <m:t>T</m:t>
                   </m:r>
                 </m:sub>
               </m:sSub>
+              <m:r>
+                <m:rPr>
+                  <m:sty m:val="p"/>
+                </m:rPr>
+                <m:t>(</m:t>
+              </m:r>
+              <m:r>
+                <m:t>1</m:t>
+              </m:r>
+              <m:r>
+                <m:rPr>
+                  <m:sty m:val="p"/>
+                </m:rPr>
+                <m:t>+</m:t>
+              </m:r>
+              <m:r>
+                <m:t>j</m:t>
+              </m:r>
+              <m:r>
+                <m:t>ω</m:t>
+              </m:r>
+              <m:sSub>
+                <m:e>
+                  <m:r>
+                    <m:t>τ</m:t>
+                  </m:r>
+                </m:e>
+                <m:sub>
+                  <m:r>
+                    <m:t>A</m:t>
+                  </m:r>
+                </m:sub>
+              </m:sSub>
+              <m:r>
+                <m:rPr>
+                  <m:sty m:val="p"/>
+                </m:rPr>
+                <m:t>)</m:t>
+              </m:r>
             </m:den>
           </m:f>
           <m:d>
@@ -165,16 +219,97 @@
               <m:sSub>
                 <m:e>
                   <m:r>
-                    <m:t>H</m:t>
+                    <m:t>W</m:t>
                   </m:r>
                 </m:e>
                 <m:sub>
                   <m:r>
-                    <m:t>1</m:t>
+                    <m:t>U</m:t>
                   </m:r>
                 </m:sub>
               </m:sSub>
               <m:r>
+                <m:t> </m:t>
+              </m:r>
+              <m:f>
+                <m:fPr>
+                  <m:type m:val="bar"/>
+                </m:fPr>
+                <m:num>
+                  <m:r>
+                    <m:t>2</m:t>
+                  </m:r>
+                  <m:r>
+                    <m:rPr>
+                      <m:sty m:val="p"/>
+                    </m:rPr>
+                    <m:t>+</m:t>
+                  </m:r>
+                  <m:r>
+                    <m:t>j</m:t>
+                  </m:r>
+                  <m:r>
+                    <m:t>ω</m:t>
+                  </m:r>
+                  <m:sSub>
+                    <m:e>
+                      <m:r>
+                        <m:t>τ</m:t>
+                      </m:r>
+                    </m:e>
+                    <m:sub>
+                      <m:r>
+                        <m:t>R</m:t>
+                      </m:r>
+                    </m:sub>
+                  </m:sSub>
+                </m:num>
+                <m:den>
+                  <m:r>
+                    <m:t>2</m:t>
+                  </m:r>
+                  <m:r>
+                    <m:rPr>
+                      <m:sty m:val="p"/>
+                    </m:rPr>
+                    <m:t>(</m:t>
+                  </m:r>
+                  <m:r>
+                    <m:t>1</m:t>
+                  </m:r>
+                  <m:r>
+                    <m:rPr>
+                      <m:sty m:val="p"/>
+                    </m:rPr>
+                    <m:t>+</m:t>
+                  </m:r>
+                  <m:r>
+                    <m:t>j</m:t>
+                  </m:r>
+                  <m:r>
+                    <m:t>ω</m:t>
+                  </m:r>
+                  <m:sSub>
+                    <m:e>
+                      <m:r>
+                        <m:t>τ</m:t>
+                      </m:r>
+                    </m:e>
+                    <m:sub>
+                      <m:r>
+                        <m:t>R</m:t>
+                      </m:r>
+                    </m:sub>
+                  </m:sSub>
+                  <m:r>
+                    <m:rPr>
+                      <m:sty m:val="p"/>
+                    </m:rPr>
+                    <m:t>)</m:t>
+                  </m:r>
+                </m:den>
+              </m:f>
+              <m:r>
                 <m:rPr>
                   <m:sty m:val="p"/>
                 </m:rPr>
@@ -183,16 +318,131 @@
               <m:sSub>
                 <m:e>
                   <m:r>
-                    <m:t>H</m:t>
+                    <m:t>W</m:t>
                   </m:r>
                 </m:e>
                 <m:sub>
                   <m:r>
-                    <m:t>2</m:t>
+                    <m:t>D</m:t>
                   </m:r>
                 </m:sub>
               </m:sSub>
               <m:r>
+                <m:t> </m:t>
+              </m:r>
+              <m:r>
+                <m:rPr>
+                  <m:sty m:val="p"/>
+                </m:rPr>
+                <m:t>s</m:t>
+              </m:r>
+              <m:r>
+                <m:rPr>
+                  <m:sty m:val="p"/>
+                </m:rPr>
+                <m:t>i</m:t>
+              </m:r>
+              <m:r>
+                <m:rPr>
+                  <m:sty m:val="p"/>
+                </m:rPr>
+                <m:t>n</m:t>
+              </m:r>
+              <m:r>
+                <m:rPr>
+                  <m:sty m:val="p"/>
+                </m:rPr>
+                <m:t>c</m:t>
+              </m:r>
+              <m:r>
+                <m:t>​</m:t>
+              </m:r>
+              <m:d>
+                <m:dPr>
+                  <m:begChr m:val="("/>
+                  <m:sepChr m:val=""/>
+                  <m:endChr m:val=")"/>
+                  <m:grow/>
+                </m:dPr>
+                <m:e>
+                  <m:f>
+                    <m:fPr>
+                      <m:type m:val="bar"/>
+                    </m:fPr>
+                    <m:num>
+                      <m:r>
+                        <m:t>ω</m:t>
+                      </m:r>
+                      <m:sSub>
+                        <m:e>
+                          <m:r>
+                            <m:t>τ</m:t>
+                          </m:r>
+                        </m:e>
+                        <m:sub>
+                          <m:r>
+                            <m:t>e</m:t>
+                          </m:r>
+                          <m:r>
+                            <m:t>D</m:t>
+                          </m:r>
+                        </m:sub>
+                      </m:sSub>
+                    </m:num>
+                    <m:den>
+                      <m:r>
+                        <m:t>2</m:t>
+                      </m:r>
+                    </m:den>
+                  </m:f>
+                </m:e>
+              </m:d>
+              <m:sSup>
+                <m:e>
+                  <m:r>
+                    <m:t>e</m:t>
+                  </m:r>
+                </m:e>
+                <m:sup>
+                  <m:r>
+                    <m:rPr>
+                      <m:sty m:val="p"/>
+                    </m:rPr>
+                    <m:t>−</m:t>
+                  </m:r>
+                  <m:r>
+                    <m:t>j</m:t>
+                  </m:r>
+                  <m:r>
+                    <m:t>ω</m:t>
+                  </m:r>
+                  <m:sSub>
+                    <m:e>
+                      <m:r>
+                        <m:t>τ</m:t>
+                      </m:r>
+                    </m:e>
+                    <m:sub>
+                      <m:r>
+                        <m:t>e</m:t>
+                      </m:r>
+                      <m:r>
+                        <m:t>D</m:t>
+                      </m:r>
+                    </m:sub>
+                  </m:sSub>
+                  <m:r>
+                    <m:rPr>
+                      <m:sty m:val="p"/>
+                    </m:rPr>
+                    <m:t>/</m:t>
+                  </m:r>
+                  <m:r>
+                    <m:t>2</m:t>
+                  </m:r>
+                </m:sup>
+              </m:sSup>
+              <m:r>
                 <m:rPr>
                   <m:sty m:val="p"/>
                 </m:rPr>
@@ -201,33 +451,940 @@
               <m:sSub>
                 <m:e>
                   <m:r>
-                    <m:t>H</m:t>
+                    <m:t>W</m:t>
                   </m:r>
                 </m:e>
                 <m:sub>
                   <m:r>
-                    <m:t>3</m:t>
+                    <m:t>C</m:t>
                   </m:r>
                 </m:sub>
               </m:sSub>
               <m:r>
-                <m:rPr>
-                  <m:sty m:val="p"/>
-                </m:rPr>
-                <m:t>+</m:t>
-              </m:r>
+                <m:t> </m:t>
+              </m:r>
+              <m:r>
+                <m:rPr>
+                  <m:sty m:val="p"/>
+                </m:rPr>
+                <m:t>s</m:t>
+              </m:r>
+              <m:r>
+                <m:rPr>
+                  <m:sty m:val="p"/>
+                </m:rPr>
+                <m:t>i</m:t>
+              </m:r>
+              <m:r>
+                <m:rPr>
+                  <m:sty m:val="p"/>
+                </m:rPr>
+                <m:t>n</m:t>
+              </m:r>
+              <m:r>
+                <m:rPr>
+                  <m:sty m:val="p"/>
+                </m:rPr>
+                <m:t>c</m:t>
+              </m:r>
+              <m:r>
+                <m:t>​</m:t>
+              </m:r>
+              <m:d>
+                <m:dPr>
+                  <m:begChr m:val="("/>
+                  <m:sepChr m:val=""/>
+                  <m:endChr m:val=")"/>
+                  <m:grow/>
+                </m:dPr>
+                <m:e>
+                  <m:f>
+                    <m:fPr>
+                      <m:type m:val="bar"/>
+                    </m:fPr>
+                    <m:num>
+                      <m:r>
+                        <m:t>ω</m:t>
+                      </m:r>
+                      <m:sSub>
+                        <m:e>
+                          <m:r>
+                            <m:t>τ</m:t>
+                          </m:r>
+                        </m:e>
+                        <m:sub>
+                          <m:r>
+                            <m:t>C</m:t>
+                          </m:r>
+                        </m:sub>
+                      </m:sSub>
+                    </m:num>
+                    <m:den>
+                      <m:r>
+                        <m:t>2</m:t>
+                      </m:r>
+                    </m:den>
+                  </m:f>
+                </m:e>
+              </m:d>
+              <m:sSup>
+                <m:e>
+                  <m:r>
+                    <m:t>e</m:t>
+                  </m:r>
+                </m:e>
+                <m:sup>
+                  <m:r>
+                    <m:rPr>
+                      <m:sty m:val="p"/>
+                    </m:rPr>
+                    <m:t>−</m:t>
+                  </m:r>
+                  <m:r>
+                    <m:t>j</m:t>
+                  </m:r>
+                  <m:r>
+                    <m:t>ω</m:t>
+                  </m:r>
+                  <m:r>
+                    <m:rPr>
+                      <m:sty m:val="p"/>
+                    </m:rPr>
+                    <m:t>(</m:t>
+                  </m:r>
+                  <m:sSub>
+                    <m:e>
+                      <m:r>
+                        <m:t>τ</m:t>
+                      </m:r>
+                    </m:e>
+                    <m:sub>
+                      <m:r>
+                        <m:t>e</m:t>
+                      </m:r>
+                      <m:r>
+                        <m:t>D</m:t>
+                      </m:r>
+                    </m:sub>
+                  </m:sSub>
+                  <m:r>
+                    <m:rPr>
+                      <m:sty m:val="p"/>
+                    </m:rPr>
+                    <m:t>+</m:t>
+                  </m:r>
+                  <m:sSub>
+                    <m:e>
+                      <m:r>
+                        <m:t>τ</m:t>
+                      </m:r>
+                    </m:e>
+                    <m:sub>
+                      <m:r>
+                        <m:t>C</m:t>
+                      </m:r>
+                    </m:sub>
+                  </m:sSub>
+                  <m:r>
+                    <m:rPr>
+                      <m:sty m:val="p"/>
+                    </m:rPr>
+                    <m:t>/</m:t>
+                  </m:r>
+                  <m:r>
+                    <m:t>2</m:t>
+                  </m:r>
+                  <m:r>
+                    <m:rPr>
+                      <m:sty m:val="p"/>
+                    </m:rPr>
+                    <m:t>)</m:t>
+                  </m:r>
+                </m:sup>
+              </m:sSup>
+            </m:e>
+          </m:d>
+        </m:oMath>
+      </m:oMathPara>
+    </w:p>
+    <w:p>
+      <w:pPr>
+        <w:pStyle w:val="FirstParagraph"/>
+      </w:pPr>
+      <m:oMathPara>
+        <m:oMathParaPr>
+          <m:jc m:val="center"/>
+        </m:oMathParaPr>
+        <m:oMath>
+          <m:r>
+            <m:rPr>
+              <m:sty m:val="p"/>
+            </m:rPr>
+            <m:t>+</m:t>
+          </m:r>
+          <m:r>
+            <m:t> </m:t>
+          </m:r>
+          <m:f>
+            <m:fPr>
+              <m:type m:val="bar"/>
+            </m:fPr>
+            <m:num>
               <m:sSub>
                 <m:e>
                   <m:r>
-                    <m:t>H</m:t>
+                    <m:t>η</m:t>
                   </m:r>
                 </m:e>
                 <m:sub>
                   <m:r>
-                    <m:t>4</m:t>
+                    <m:t>D</m:t>
                   </m:r>
                 </m:sub>
               </m:sSub>
+            </m:num>
+            <m:den>
+              <m:sSub>
+                <m:e>
+                  <m:r>
+                    <m:t>W</m:t>
+                  </m:r>
+                </m:e>
+                <m:sub>
+                  <m:r>
+                    <m:t>T</m:t>
+                  </m:r>
+                </m:sub>
+              </m:sSub>
+            </m:den>
+          </m:f>
+          <m:d>
+            <m:dPr>
+              <m:begChr m:val="["/>
+              <m:sepChr m:val=""/>
+              <m:endChr m:val=""/>
+              <m:grow/>
+            </m:dPr>
+            <m:e>
+              <m:sSub>
+                <m:e>
+                  <m:r>
+                    <m:t>W</m:t>
+                  </m:r>
+                </m:e>
+                <m:sub>
+                  <m:r>
+                    <m:t>U</m:t>
+                  </m:r>
+                </m:sub>
+              </m:sSub>
+              <m:r>
+                <m:t> </m:t>
+              </m:r>
+              <m:r>
+                <m:rPr>
+                  <m:sty m:val="p"/>
+                </m:rPr>
+                <m:t>s</m:t>
+              </m:r>
+              <m:r>
+                <m:rPr>
+                  <m:sty m:val="p"/>
+                </m:rPr>
+                <m:t>i</m:t>
+              </m:r>
+              <m:r>
+                <m:rPr>
+                  <m:sty m:val="p"/>
+                </m:rPr>
+                <m:t>n</m:t>
+              </m:r>
+              <m:r>
+                <m:rPr>
+                  <m:sty m:val="p"/>
+                </m:rPr>
+                <m:t>c</m:t>
+              </m:r>
+              <m:r>
+                <m:t>​</m:t>
+              </m:r>
+              <m:d>
+                <m:dPr>
+                  <m:begChr m:val="("/>
+                  <m:sepChr m:val=""/>
+                  <m:endChr m:val=")"/>
+                  <m:grow/>
+                </m:dPr>
+                <m:e>
+                  <m:f>
+                    <m:fPr>
+                      <m:type m:val="bar"/>
+                    </m:fPr>
+                    <m:num>
+                      <m:r>
+                        <m:t>ω</m:t>
+                      </m:r>
+                      <m:sSub>
+                        <m:e>
+                          <m:r>
+                            <m:t>τ</m:t>
+                          </m:r>
+                        </m:e>
+                        <m:sub>
+                          <m:r>
+                            <m:t>h</m:t>
+                          </m:r>
+                        </m:sub>
+                      </m:sSub>
+                    </m:num>
+                    <m:den>
+                      <m:r>
+                        <m:t>2</m:t>
+                      </m:r>
+                    </m:den>
+                  </m:f>
+                </m:e>
+              </m:d>
+              <m:sSup>
+                <m:e>
+                  <m:r>
+                    <m:t>e</m:t>
+                  </m:r>
+                </m:e>
+                <m:sup>
+                  <m:r>
+                    <m:rPr>
+                      <m:sty m:val="p"/>
+                    </m:rPr>
+                    <m:t>−</m:t>
+                  </m:r>
+                  <m:r>
+                    <m:t>j</m:t>
+                  </m:r>
+                  <m:r>
+                    <m:t>ω</m:t>
+                  </m:r>
+                  <m:sSub>
+                    <m:e>
+                      <m:r>
+                        <m:t>τ</m:t>
+                      </m:r>
+                    </m:e>
+                    <m:sub>
+                      <m:r>
+                        <m:t>h</m:t>
+                      </m:r>
+                    </m:sub>
+                  </m:sSub>
+                  <m:r>
+                    <m:rPr>
+                      <m:sty m:val="p"/>
+                    </m:rPr>
+                    <m:t>/</m:t>
+                  </m:r>
+                  <m:r>
+                    <m:t>2</m:t>
+                  </m:r>
+                </m:sup>
+              </m:sSup>
+              <m:r>
+                <m:rPr>
+                  <m:sty m:val="p"/>
+                </m:rPr>
+                <m:t>+</m:t>
+              </m:r>
+              <m:f>
+                <m:fPr>
+                  <m:type m:val="bar"/>
+                </m:fPr>
+                <m:num>
+                  <m:sSub>
+                    <m:e>
+                      <m:r>
+                        <m:t>W</m:t>
+                      </m:r>
+                    </m:e>
+                    <m:sub>
+                      <m:r>
+                        <m:t>D</m:t>
+                      </m:r>
+                    </m:sub>
+                  </m:sSub>
+                </m:num>
+                <m:den>
+                  <m:r>
+                    <m:t>j</m:t>
+                  </m:r>
+                  <m:r>
+                    <m:t>ω</m:t>
+                  </m:r>
+                  <m:sSub>
+                    <m:e>
+                      <m:r>
+                        <m:t>τ</m:t>
+                      </m:r>
+                    </m:e>
+                    <m:sub>
+                      <m:r>
+                        <m:t>e</m:t>
+                      </m:r>
+                      <m:r>
+                        <m:t>D</m:t>
+                      </m:r>
+                    </m:sub>
+                  </m:sSub>
+                </m:den>
+              </m:f>
+              <m:d>
+                <m:dPr>
+                  <m:begChr m:val="{"/>
+                  <m:sepChr m:val=""/>
+                  <m:endChr m:val="}"/>
+                  <m:grow/>
+                </m:dPr>
+                <m:e>
+                  <m:r>
+                    <m:t>1</m:t>
+                  </m:r>
+                  <m:r>
+                    <m:rPr>
+                      <m:sty m:val="p"/>
+                    </m:rPr>
+                    <m:t>−</m:t>
+                  </m:r>
+                  <m:r>
+                    <m:rPr>
+                      <m:sty m:val="p"/>
+                    </m:rPr>
+                    <m:t>s</m:t>
+                  </m:r>
+                  <m:r>
+                    <m:rPr>
+                      <m:sty m:val="p"/>
+                    </m:rPr>
+                    <m:t>i</m:t>
+                  </m:r>
+                  <m:r>
+                    <m:rPr>
+                      <m:sty m:val="p"/>
+                    </m:rPr>
+                    <m:t>n</m:t>
+                  </m:r>
+                  <m:r>
+                    <m:rPr>
+                      <m:sty m:val="p"/>
+                    </m:rPr>
+                    <m:t>c</m:t>
+                  </m:r>
+                  <m:r>
+                    <m:t>​</m:t>
+                  </m:r>
+                  <m:d>
+                    <m:dPr>
+                      <m:begChr m:val="("/>
+                      <m:sepChr m:val=""/>
+                      <m:endChr m:val=")"/>
+                      <m:grow/>
+                    </m:dPr>
+                    <m:e>
+                      <m:f>
+                        <m:fPr>
+                          <m:type m:val="bar"/>
+                        </m:fPr>
+                        <m:num>
+                          <m:r>
+                            <m:t>ω</m:t>
+                          </m:r>
+                          <m:sSub>
+                            <m:e>
+                              <m:r>
+                                <m:t>τ</m:t>
+                              </m:r>
+                            </m:e>
+                            <m:sub>
+                              <m:r>
+                                <m:t>e</m:t>
+                              </m:r>
+                              <m:r>
+                                <m:t>D</m:t>
+                              </m:r>
+                            </m:sub>
+                          </m:sSub>
+                        </m:num>
+                        <m:den>
+                          <m:r>
+                            <m:t>2</m:t>
+                          </m:r>
+                        </m:den>
+                      </m:f>
+                    </m:e>
+                  </m:d>
+                  <m:sSup>
+                    <m:e>
+                      <m:r>
+                        <m:t>e</m:t>
+                      </m:r>
+                    </m:e>
+                    <m:sup>
+                      <m:r>
+                        <m:rPr>
+                          <m:sty m:val="p"/>
+                        </m:rPr>
+                        <m:t>−</m:t>
+                      </m:r>
+                      <m:r>
+                        <m:t>j</m:t>
+                      </m:r>
+                      <m:r>
+                        <m:t>ω</m:t>
+                      </m:r>
+                      <m:sSub>
+                        <m:e>
+                          <m:r>
+                            <m:t>τ</m:t>
+                          </m:r>
+                        </m:e>
+                        <m:sub>
+                          <m:r>
+                            <m:t>e</m:t>
+                          </m:r>
+                          <m:r>
+                            <m:t>D</m:t>
+                          </m:r>
+                        </m:sub>
+                      </m:sSub>
+                      <m:r>
+                        <m:rPr>
+                          <m:sty m:val="p"/>
+                        </m:rPr>
+                        <m:t>/</m:t>
+                      </m:r>
+                      <m:r>
+                        <m:t>2</m:t>
+                      </m:r>
+                    </m:sup>
+                  </m:sSup>
+                </m:e>
+              </m:d>
+            </m:e>
+          </m:d>
+        </m:oMath>
+      </m:oMathPara>
+    </w:p>
+    <w:p>
+      <w:pPr>
+        <w:pStyle w:val="FirstParagraph"/>
+      </w:pPr>
+      <m:oMathPara>
+        <m:oMathParaPr>
+          <m:jc m:val="center"/>
+        </m:oMathParaPr>
+        <m:oMath>
+          <m:d>
+            <m:dPr>
+              <m:begChr m:val=""/>
+              <m:sepChr m:val=""/>
+              <m:endChr m:val="]"/>
+              <m:grow/>
+            </m:dPr>
+            <m:e>
+              <m:r>
+                <m:rPr>
+                  <m:sty m:val="p"/>
+                </m:rPr>
+                <m:t>+</m:t>
+              </m:r>
+              <m:f>
+                <m:fPr>
+                  <m:type m:val="bar"/>
+                </m:fPr>
+                <m:num>
+                  <m:sSub>
+                    <m:e>
+                      <m:r>
+                        <m:t>W</m:t>
+                      </m:r>
+                    </m:e>
+                    <m:sub>
+                      <m:r>
+                        <m:t>D</m:t>
+                      </m:r>
+                    </m:sub>
+                  </m:sSub>
+                </m:num>
+                <m:den>
+                  <m:r>
+                    <m:t>j</m:t>
+                  </m:r>
+                  <m:r>
+                    <m:t>ω</m:t>
+                  </m:r>
+                  <m:sSub>
+                    <m:e>
+                      <m:r>
+                        <m:t>τ</m:t>
+                      </m:r>
+                    </m:e>
+                    <m:sub>
+                      <m:r>
+                        <m:t>h</m:t>
+                      </m:r>
+                    </m:sub>
+                  </m:sSub>
+                </m:den>
+              </m:f>
+              <m:d>
+                <m:dPr>
+                  <m:begChr m:val="{"/>
+                  <m:sepChr m:val=""/>
+                  <m:endChr m:val="}"/>
+                  <m:grow/>
+                </m:dPr>
+                <m:e>
+                  <m:r>
+                    <m:t>1</m:t>
+                  </m:r>
+                  <m:r>
+                    <m:rPr>
+                      <m:sty m:val="p"/>
+                    </m:rPr>
+                    <m:t>−</m:t>
+                  </m:r>
+                  <m:r>
+                    <m:rPr>
+                      <m:sty m:val="p"/>
+                    </m:rPr>
+                    <m:t>s</m:t>
+                  </m:r>
+                  <m:r>
+                    <m:rPr>
+                      <m:sty m:val="p"/>
+                    </m:rPr>
+                    <m:t>i</m:t>
+                  </m:r>
+                  <m:r>
+                    <m:rPr>
+                      <m:sty m:val="p"/>
+                    </m:rPr>
+                    <m:t>n</m:t>
+                  </m:r>
+                  <m:r>
+                    <m:rPr>
+                      <m:sty m:val="p"/>
+                    </m:rPr>
+                    <m:t>c</m:t>
+                  </m:r>
+                  <m:r>
+                    <m:t>​</m:t>
+                  </m:r>
+                  <m:d>
+                    <m:dPr>
+                      <m:begChr m:val="("/>
+                      <m:sepChr m:val=""/>
+                      <m:endChr m:val=")"/>
+                      <m:grow/>
+                    </m:dPr>
+                    <m:e>
+                      <m:f>
+                        <m:fPr>
+                          <m:type m:val="bar"/>
+                        </m:fPr>
+                        <m:num>
+                          <m:r>
+                            <m:t>ω</m:t>
+                          </m:r>
+                          <m:sSub>
+                            <m:e>
+                              <m:r>
+                                <m:t>τ</m:t>
+                              </m:r>
+                            </m:e>
+                            <m:sub>
+                              <m:r>
+                                <m:t>h</m:t>
+                              </m:r>
+                            </m:sub>
+                          </m:sSub>
+                        </m:num>
+                        <m:den>
+                          <m:r>
+                            <m:t>2</m:t>
+                          </m:r>
+                        </m:den>
+                      </m:f>
+                    </m:e>
+                  </m:d>
+                  <m:sSup>
+                    <m:e>
+                      <m:r>
+                        <m:t>e</m:t>
+                      </m:r>
+                    </m:e>
+                    <m:sup>
+                      <m:r>
+                        <m:rPr>
+                          <m:sty m:val="p"/>
+                        </m:rPr>
+                        <m:t>−</m:t>
+                      </m:r>
+                      <m:r>
+                        <m:t>j</m:t>
+                      </m:r>
+                      <m:r>
+                        <m:t>ω</m:t>
+                      </m:r>
+                      <m:sSub>
+                        <m:e>
+                          <m:r>
+                            <m:t>τ</m:t>
+                          </m:r>
+                        </m:e>
+                        <m:sub>
+                          <m:r>
+                            <m:t>h</m:t>
+                          </m:r>
+                        </m:sub>
+                      </m:sSub>
+                      <m:r>
+                        <m:rPr>
+                          <m:sty m:val="p"/>
+                        </m:rPr>
+                        <m:t>/</m:t>
+                      </m:r>
+                      <m:r>
+                        <m:t>2</m:t>
+                      </m:r>
+                    </m:sup>
+                  </m:sSup>
+                </m:e>
+              </m:d>
+              <m:r>
+                <m:rPr>
+                  <m:sty m:val="p"/>
+                </m:rPr>
+                <m:t>+</m:t>
+              </m:r>
+              <m:sSub>
+                <m:e>
+                  <m:r>
+                    <m:t>W</m:t>
+                  </m:r>
+                </m:e>
+                <m:sub>
+                  <m:r>
+                    <m:t>C</m:t>
+                  </m:r>
+                </m:sub>
+              </m:sSub>
+              <m:r>
+                <m:t> </m:t>
+              </m:r>
+              <m:r>
+                <m:rPr>
+                  <m:sty m:val="p"/>
+                </m:rPr>
+                <m:t>s</m:t>
+              </m:r>
+              <m:r>
+                <m:rPr>
+                  <m:sty m:val="p"/>
+                </m:rPr>
+                <m:t>i</m:t>
+              </m:r>
+              <m:r>
+                <m:rPr>
+                  <m:sty m:val="p"/>
+                </m:rPr>
+                <m:t>n</m:t>
+              </m:r>
+              <m:r>
+                <m:rPr>
+                  <m:sty m:val="p"/>
+                </m:rPr>
+                <m:t>c</m:t>
+              </m:r>
+              <m:r>
+                <m:t>​</m:t>
+              </m:r>
+              <m:d>
+                <m:dPr>
+                  <m:begChr m:val="("/>
+                  <m:sepChr m:val=""/>
+                  <m:endChr m:val=")"/>
+                  <m:grow/>
+                </m:dPr>
+                <m:e>
+                  <m:f>
+                    <m:fPr>
+                      <m:type m:val="bar"/>
+                    </m:fPr>
+                    <m:num>
+                      <m:r>
+                        <m:t>ω</m:t>
+                      </m:r>
+                      <m:sSub>
+                        <m:e>
+                          <m:r>
+                            <m:t>τ</m:t>
+                          </m:r>
+                        </m:e>
+                        <m:sub>
+                          <m:r>
+                            <m:t>e</m:t>
+                          </m:r>
+                          <m:r>
+                            <m:t>D</m:t>
+                          </m:r>
+                        </m:sub>
+                      </m:sSub>
+                    </m:num>
+                    <m:den>
+                      <m:r>
+                        <m:t>2</m:t>
+                      </m:r>
+                    </m:den>
+                  </m:f>
+                </m:e>
+              </m:d>
+              <m:r>
+                <m:rPr>
+                  <m:sty m:val="p"/>
+                </m:rPr>
+                <m:t>s</m:t>
+              </m:r>
+              <m:r>
+                <m:rPr>
+                  <m:sty m:val="p"/>
+                </m:rPr>
+                <m:t>i</m:t>
+              </m:r>
+              <m:r>
+                <m:rPr>
+                  <m:sty m:val="p"/>
+                </m:rPr>
+                <m:t>n</m:t>
+              </m:r>
+              <m:r>
+                <m:rPr>
+                  <m:sty m:val="p"/>
+                </m:rPr>
+                <m:t>c</m:t>
+              </m:r>
+              <m:r>
+                <m:t>​</m:t>
+              </m:r>
+              <m:d>
+                <m:dPr>
+                  <m:begChr m:val="("/>
+                  <m:sepChr m:val=""/>
+                  <m:endChr m:val=")"/>
+                  <m:grow/>
+                </m:dPr>
+                <m:e>
+                  <m:f>
+                    <m:fPr>
+                      <m:type m:val="bar"/>
+                    </m:fPr>
+                    <m:num>
+                      <m:r>
+                        <m:t>ω</m:t>
+                      </m:r>
+                      <m:sSub>
+                        <m:e>
+                          <m:r>
+                            <m:t>τ</m:t>
+                          </m:r>
+                        </m:e>
+                        <m:sub>
+                          <m:r>
+                            <m:t>C</m:t>
+                          </m:r>
+                        </m:sub>
+                      </m:sSub>
+                    </m:num>
+                    <m:den>
+                      <m:r>
+                        <m:t>2</m:t>
+                      </m:r>
+                    </m:den>
+                  </m:f>
+                </m:e>
+              </m:d>
+              <m:sSup>
+                <m:e>
+                  <m:r>
+                    <m:t>e</m:t>
+                  </m:r>
+                </m:e>
+                <m:sup>
+                  <m:r>
+                    <m:rPr>
+                      <m:sty m:val="p"/>
+                    </m:rPr>
+                    <m:t>−</m:t>
+                  </m:r>
+                  <m:r>
+                    <m:t>j</m:t>
+                  </m:r>
+                  <m:r>
+                    <m:t>ω</m:t>
+                  </m:r>
+                  <m:r>
+                    <m:rPr>
+                      <m:sty m:val="p"/>
+                    </m:rPr>
+                    <m:t>(</m:t>
+                  </m:r>
+                  <m:sSub>
+                    <m:e>
+                      <m:r>
+                        <m:t>τ</m:t>
+                      </m:r>
+                    </m:e>
+                    <m:sub>
+                      <m:r>
+                        <m:t>e</m:t>
+                      </m:r>
+                      <m:r>
+                        <m:t>D</m:t>
+                      </m:r>
+                    </m:sub>
+                  </m:sSub>
+                  <m:r>
+                    <m:rPr>
+                      <m:sty m:val="p"/>
+                    </m:rPr>
+                    <m:t>+</m:t>
+                  </m:r>
+                  <m:sSub>
+                    <m:e>
+                      <m:r>
+                        <m:t>τ</m:t>
+                      </m:r>
+                    </m:e>
+                    <m:sub>
+                      <m:r>
+                        <m:t>C</m:t>
+                      </m:r>
+                    </m:sub>
+                  </m:sSub>
+                  <m:r>
+                    <m:rPr>
+                      <m:sty m:val="p"/>
+                    </m:rPr>
+                    <m:t>/</m:t>
+                  </m:r>
+                  <m:r>
+                    <m:t>2</m:t>
+                  </m:r>
+                  <m:r>
+                    <m:rPr>
+                      <m:sty m:val="p"/>
+                    </m:rPr>
+                    <m:t>)</m:t>
+                  </m:r>
+                </m:sup>
+              </m:sSup>
             </m:e>
           </m:d>
         </m:oMath>
@@ -238,7 +1395,303 @@
         <w:pStyle w:val="FirstParagraph"/>
       </w:pPr>
       <w:r>
-        <w:t xml:space="preserve">Term 1 — undepleted-absorber electron (diffusion; carries</w:t>
+        <w:t xml:space="preserve">with</w:t>
+      </w:r>
+      <w:r>
+        <w:t xml:space="preserve"> </w:t>
+      </w:r>
+      <m:oMath>
+        <m:sSub>
+          <m:e>
+            <m:r>
+              <m:t>W</m:t>
+            </m:r>
+          </m:e>
+          <m:sub>
+            <m:r>
+              <m:t>T</m:t>
+            </m:r>
+          </m:sub>
+        </m:sSub>
+        <m:r>
+          <m:rPr>
+            <m:sty m:val="p"/>
+          </m:rPr>
+          <m:t>=</m:t>
+        </m:r>
+        <m:sSub>
+          <m:e>
+            <m:r>
+              <m:t>W</m:t>
+            </m:r>
+          </m:e>
+          <m:sub>
+            <m:r>
+              <m:t>U</m:t>
+            </m:r>
+          </m:sub>
+        </m:sSub>
+        <m:r>
+          <m:rPr>
+            <m:sty m:val="p"/>
+          </m:rPr>
+          <m:t>+</m:t>
+        </m:r>
+        <m:sSub>
+          <m:e>
+            <m:r>
+              <m:t>W</m:t>
+            </m:r>
+          </m:e>
+          <m:sub>
+            <m:r>
+              <m:t>D</m:t>
+            </m:r>
+          </m:sub>
+        </m:sSub>
+        <m:r>
+          <m:rPr>
+            <m:sty m:val="p"/>
+          </m:rPr>
+          <m:t>+</m:t>
+        </m:r>
+        <m:sSub>
+          <m:e>
+            <m:r>
+              <m:t>W</m:t>
+            </m:r>
+          </m:e>
+          <m:sub>
+            <m:r>
+              <m:t>C</m:t>
+            </m:r>
+          </m:sub>
+        </m:sSub>
+      </m:oMath>
+      <w:r>
+        <w:t xml:space="preserve">,</w:t>
+      </w:r>
+      <w:r>
+        <w:t xml:space="preserve"> </w:t>
+      </w:r>
+      <m:oMath>
+        <m:r>
+          <m:t> </m:t>
+        </m:r>
+        <m:sSub>
+          <m:e>
+            <m:r>
+              <m:t>η</m:t>
+            </m:r>
+          </m:e>
+          <m:sub>
+            <m:r>
+              <m:t>U</m:t>
+            </m:r>
+          </m:sub>
+        </m:sSub>
+        <m:r>
+          <m:rPr>
+            <m:sty m:val="p"/>
+          </m:rPr>
+          <m:t>+</m:t>
+        </m:r>
+        <m:sSub>
+          <m:e>
+            <m:r>
+              <m:t>η</m:t>
+            </m:r>
+          </m:e>
+          <m:sub>
+            <m:r>
+              <m:t>D</m:t>
+            </m:r>
+          </m:sub>
+        </m:sSub>
+        <m:r>
+          <m:rPr>
+            <m:sty m:val="p"/>
+          </m:rPr>
+          <m:t>=</m:t>
+        </m:r>
+        <m:r>
+          <m:t>1</m:t>
+        </m:r>
+      </m:oMath>
+      <w:r>
+        <w:t xml:space="preserve">, and</w:t>
+      </w:r>
+      <w:r>
+        <w:t xml:space="preserve"> </w:t>
+      </w:r>
+      <m:oMath>
+        <m:r>
+          <m:rPr>
+            <m:sty m:val="p"/>
+          </m:rPr>
+          <m:t>s</m:t>
+        </m:r>
+        <m:r>
+          <m:rPr>
+            <m:sty m:val="p"/>
+          </m:rPr>
+          <m:t>i</m:t>
+        </m:r>
+        <m:r>
+          <m:rPr>
+            <m:sty m:val="p"/>
+          </m:rPr>
+          <m:t>n</m:t>
+        </m:r>
+        <m:r>
+          <m:rPr>
+            <m:sty m:val="p"/>
+          </m:rPr>
+          <m:t>c</m:t>
+        </m:r>
+        <m:r>
+          <m:rPr>
+            <m:sty m:val="p"/>
+          </m:rPr>
+          <m:t>(</m:t>
+        </m:r>
+        <m:r>
+          <m:t>x</m:t>
+        </m:r>
+        <m:r>
+          <m:rPr>
+            <m:sty m:val="p"/>
+          </m:rPr>
+          <m:t>)</m:t>
+        </m:r>
+        <m:r>
+          <m:rPr>
+            <m:sty m:val="p"/>
+          </m:rPr>
+          <m:t>=</m:t>
+        </m:r>
+        <m:f>
+          <m:fPr>
+            <m:type m:val="bar"/>
+          </m:fPr>
+          <m:num>
+            <m:r>
+              <m:rPr>
+                <m:sty m:val="p"/>
+              </m:rPr>
+              <m:t>sin</m:t>
+            </m:r>
+            <m:r>
+              <m:t>x</m:t>
+            </m:r>
+          </m:num>
+          <m:den>
+            <m:r>
+              <m:t>x</m:t>
+            </m:r>
+          </m:den>
+        </m:f>
+      </m:oMath>
+      <w:r>
+        <w:t xml:space="preserve">.</w:t>
+      </w:r>
+    </w:p>
+    <w:p>
+      <w:pPr>
+        <w:pStyle w:val="BodyText"/>
+      </w:pPr>
+      <w:r>
+        <w:t xml:space="preserve">The first bracket (</w:t>
+      </w:r>
+      <m:oMath>
+        <m:sSub>
+          <m:e>
+            <m:r>
+              <m:t>η</m:t>
+            </m:r>
+          </m:e>
+          <m:sub>
+            <m:r>
+              <m:t>U</m:t>
+            </m:r>
+          </m:sub>
+        </m:sSub>
+      </m:oMath>
+      <w:r>
+        <w:t xml:space="preserve">) is the undepleted-absorber-generated group and carries the diffusion pole</w:t>
+      </w:r>
+      <w:r>
+        <w:t xml:space="preserve"> </w:t>
+      </w:r>
+      <m:oMath>
+        <m:r>
+          <m:t>1</m:t>
+        </m:r>
+        <m:r>
+          <m:rPr>
+            <m:sty m:val="p"/>
+          </m:rPr>
+          <m:t>/</m:t>
+        </m:r>
+        <m:r>
+          <m:rPr>
+            <m:sty m:val="p"/>
+          </m:rPr>
+          <m:t>(</m:t>
+        </m:r>
+        <m:r>
+          <m:t>1</m:t>
+        </m:r>
+        <m:r>
+          <m:rPr>
+            <m:sty m:val="p"/>
+          </m:rPr>
+          <m:t>+</m:t>
+        </m:r>
+        <m:r>
+          <m:t>j</m:t>
+        </m:r>
+        <m:r>
+          <m:t>ω</m:t>
+        </m:r>
+        <m:sSub>
+          <m:e>
+            <m:r>
+              <m:t>τ</m:t>
+            </m:r>
+          </m:e>
+          <m:sub>
+            <m:r>
+              <m:t>A</m:t>
+            </m:r>
+          </m:sub>
+        </m:sSub>
+        <m:r>
+          <m:rPr>
+            <m:sty m:val="p"/>
+          </m:rPr>
+          <m:t>)</m:t>
+        </m:r>
+      </m:oMath>
+      <w:r>
+        <w:t xml:space="preserve">; the second bracket (</w:t>
+      </w:r>
+      <m:oMath>
+        <m:sSub>
+          <m:e>
+            <m:r>
+              <m:t>η</m:t>
+            </m:r>
+          </m:e>
+          <m:sub>
+            <m:r>
+              <m:t>D</m:t>
+            </m:r>
+          </m:sub>
+        </m:sSub>
+      </m:oMath>
+      <w:r>
+        <w:t xml:space="preserve">) is the depleted-absorber in-situ group (electron + hole, uniform-generation triangular transit) and carries no</w:t>
       </w:r>
       <w:r>
         <w:t xml:space="preserve"> </w:t>
@@ -258,958 +1711,17 @@
         </m:sSub>
       </m:oMath>
       <w:r>
-        <w:t xml:space="preserve">):</w:t>
+        <w:t xml:space="preserve">.</w:t>
       </w:r>
     </w:p>
-    <w:p>
-      <w:pPr>
-        <w:pStyle w:val="BodyText"/>
-      </w:pPr>
-      <m:oMathPara>
-        <m:oMathParaPr>
-          <m:jc m:val="center"/>
-        </m:oMathParaPr>
-        <m:oMath>
-          <m:sSub>
-            <m:e>
-              <m:r>
-                <m:t>H</m:t>
-              </m:r>
-            </m:e>
-            <m:sub>
-              <m:r>
-                <m:t>1</m:t>
-              </m:r>
-            </m:sub>
-          </m:sSub>
-          <m:r>
-            <m:rPr>
-              <m:sty m:val="p"/>
-            </m:rPr>
-            <m:t>=</m:t>
-          </m:r>
-          <m:f>
-            <m:fPr>
-              <m:type m:val="bar"/>
-            </m:fPr>
-            <m:num>
-              <m:sSub>
-                <m:e>
-                  <m:r>
-                    <m:t>W</m:t>
-                  </m:r>
-                </m:e>
-                <m:sub>
-                  <m:r>
-                    <m:t>A</m:t>
-                  </m:r>
-                </m:sub>
-              </m:sSub>
-            </m:num>
-            <m:den>
-              <m:r>
-                <m:t>1</m:t>
-              </m:r>
-              <m:r>
-                <m:rPr>
-                  <m:sty m:val="p"/>
-                </m:rPr>
-                <m:t>+</m:t>
-              </m:r>
-              <m:r>
-                <m:t>j</m:t>
-              </m:r>
-              <m:r>
-                <m:t>ω</m:t>
-              </m:r>
-              <m:sSub>
-                <m:e>
-                  <m:r>
-                    <m:t>τ</m:t>
-                  </m:r>
-                </m:e>
-                <m:sub>
-                  <m:r>
-                    <m:t>A</m:t>
-                  </m:r>
-                </m:sub>
-              </m:sSub>
-            </m:den>
-          </m:f>
-          <m:r>
-            <m:rPr>
-              <m:sty m:val="p"/>
-            </m:rPr>
-            <m:t>⋅</m:t>
-          </m:r>
-          <m:f>
-            <m:fPr>
-              <m:type m:val="bar"/>
-            </m:fPr>
-            <m:num>
-              <m:r>
-                <m:t>2</m:t>
-              </m:r>
-              <m:r>
-                <m:rPr>
-                  <m:sty m:val="p"/>
-                </m:rPr>
-                <m:t>+</m:t>
-              </m:r>
-              <m:r>
-                <m:t>j</m:t>
-              </m:r>
-              <m:r>
-                <m:t>ω</m:t>
-              </m:r>
-              <m:sSub>
-                <m:e>
-                  <m:r>
-                    <m:t>τ</m:t>
-                  </m:r>
-                </m:e>
-                <m:sub>
-                  <m:r>
-                    <m:t>R</m:t>
-                  </m:r>
-                </m:sub>
-              </m:sSub>
-            </m:num>
-            <m:den>
-              <m:r>
-                <m:t>2</m:t>
-              </m:r>
-              <m:r>
-                <m:t> </m:t>
-              </m:r>
-              <m:r>
-                <m:rPr>
-                  <m:sty m:val="p"/>
-                </m:rPr>
-                <m:t>(</m:t>
-              </m:r>
-              <m:r>
-                <m:t>1</m:t>
-              </m:r>
-              <m:r>
-                <m:rPr>
-                  <m:sty m:val="p"/>
-                </m:rPr>
-                <m:t>+</m:t>
-              </m:r>
-              <m:r>
-                <m:t>j</m:t>
-              </m:r>
-              <m:r>
-                <m:t>ω</m:t>
-              </m:r>
-              <m:sSub>
-                <m:e>
-                  <m:r>
-                    <m:t>τ</m:t>
-                  </m:r>
-                </m:e>
-                <m:sub>
-                  <m:r>
-                    <m:t>R</m:t>
-                  </m:r>
-                </m:sub>
-              </m:sSub>
-              <m:r>
-                <m:rPr>
-                  <m:sty m:val="p"/>
-                </m:rPr>
-                <m:t>)</m:t>
-              </m:r>
-            </m:den>
-          </m:f>
-        </m:oMath>
-      </m:oMathPara>
-    </w:p>
-    <w:p>
-      <w:pPr>
-        <w:pStyle w:val="FirstParagraph"/>
-      </w:pPr>
-      <w:r>
-        <w:t xml:space="preserve">Term 2 — the same electron drifting the depleted region (carries</w:t>
-      </w:r>
-      <w:r>
-        <w:t xml:space="preserve"> </w:t>
-      </w:r>
-      <m:oMath>
-        <m:sSub>
-          <m:e>
-            <m:r>
-              <m:t>τ</m:t>
-            </m:r>
-          </m:e>
-          <m:sub>
-            <m:r>
-              <m:t>A</m:t>
-            </m:r>
-          </m:sub>
-        </m:sSub>
-      </m:oMath>
-      <w:r>
-        <w:t xml:space="preserve">):</w:t>
-      </w:r>
-    </w:p>
-    <w:p>
-      <w:pPr>
-        <w:pStyle w:val="BodyText"/>
-      </w:pPr>
-      <m:oMathPara>
-        <m:oMathParaPr>
-          <m:jc m:val="center"/>
-        </m:oMathParaPr>
-        <m:oMath>
-          <m:sSub>
-            <m:e>
-              <m:r>
-                <m:t>H</m:t>
-              </m:r>
-            </m:e>
-            <m:sub>
-              <m:r>
-                <m:t>2</m:t>
-              </m:r>
-            </m:sub>
-          </m:sSub>
-          <m:r>
-            <m:rPr>
-              <m:sty m:val="p"/>
-            </m:rPr>
-            <m:t>=</m:t>
-          </m:r>
-          <m:f>
-            <m:fPr>
-              <m:type m:val="bar"/>
-            </m:fPr>
-            <m:num>
-              <m:sSub>
-                <m:e>
-                  <m:r>
-                    <m:t>W</m:t>
-                  </m:r>
-                </m:e>
-                <m:sub>
-                  <m:r>
-                    <m:t>C</m:t>
-                  </m:r>
-                </m:sub>
-              </m:sSub>
-            </m:num>
-            <m:den>
-              <m:r>
-                <m:t>1</m:t>
-              </m:r>
-              <m:r>
-                <m:rPr>
-                  <m:sty m:val="p"/>
-                </m:rPr>
-                <m:t>+</m:t>
-              </m:r>
-              <m:r>
-                <m:t>j</m:t>
-              </m:r>
-              <m:r>
-                <m:t>ω</m:t>
-              </m:r>
-              <m:sSub>
-                <m:e>
-                  <m:r>
-                    <m:t>τ</m:t>
-                  </m:r>
-                </m:e>
-                <m:sub>
-                  <m:r>
-                    <m:t>A</m:t>
-                  </m:r>
-                </m:sub>
-              </m:sSub>
-            </m:den>
-          </m:f>
-          <m:r>
-            <m:t> </m:t>
-          </m:r>
-          <m:r>
-            <m:rPr>
-              <m:sty m:val="p"/>
-            </m:rPr>
-            <m:t>s</m:t>
-          </m:r>
-          <m:r>
-            <m:rPr>
-              <m:sty m:val="p"/>
-            </m:rPr>
-            <m:t>i</m:t>
-          </m:r>
-          <m:r>
-            <m:rPr>
-              <m:sty m:val="p"/>
-            </m:rPr>
-            <m:t>n</m:t>
-          </m:r>
-          <m:r>
-            <m:rPr>
-              <m:sty m:val="p"/>
-            </m:rPr>
-            <m:t>c</m:t>
-          </m:r>
-          <m:r>
-            <m:t>​</m:t>
-          </m:r>
-          <m:d>
-            <m:dPr>
-              <m:begChr m:val="("/>
-              <m:sepChr m:val=""/>
-              <m:endChr m:val=")"/>
-              <m:grow/>
-            </m:dPr>
-            <m:e>
-              <m:f>
-                <m:fPr>
-                  <m:type m:val="bar"/>
-                </m:fPr>
-                <m:num>
-                  <m:r>
-                    <m:t>ω</m:t>
-                  </m:r>
-                  <m:sSub>
-                    <m:e>
-                      <m:r>
-                        <m:t>τ</m:t>
-                      </m:r>
-                    </m:e>
-                    <m:sub>
-                      <m:r>
-                        <m:t>C</m:t>
-                      </m:r>
-                    </m:sub>
-                  </m:sSub>
-                </m:num>
-                <m:den>
-                  <m:r>
-                    <m:t>2</m:t>
-                  </m:r>
-                </m:den>
-              </m:f>
-            </m:e>
-          </m:d>
-          <m:sSup>
-            <m:e>
-              <m:r>
-                <m:t>e</m:t>
-              </m:r>
-            </m:e>
-            <m:sup>
-              <m:r>
-                <m:rPr>
-                  <m:sty m:val="p"/>
-                </m:rPr>
-                <m:t>−</m:t>
-              </m:r>
-              <m:r>
-                <m:t>j</m:t>
-              </m:r>
-              <m:r>
-                <m:t>ω</m:t>
-              </m:r>
-              <m:sSub>
-                <m:e>
-                  <m:r>
-                    <m:t>τ</m:t>
-                  </m:r>
-                </m:e>
-                <m:sub>
-                  <m:r>
-                    <m:t>C</m:t>
-                  </m:r>
-                </m:sub>
-              </m:sSub>
-              <m:r>
-                <m:rPr>
-                  <m:sty m:val="p"/>
-                </m:rPr>
-                <m:t>/</m:t>
-              </m:r>
-              <m:r>
-                <m:t>2</m:t>
-              </m:r>
-            </m:sup>
-          </m:sSup>
-        </m:oMath>
-      </m:oMathPara>
-    </w:p>
-    <w:p>
-      <w:pPr>
-        <w:pStyle w:val="FirstParagraph"/>
-      </w:pPr>
-      <w:r>
-        <w:t xml:space="preserve">Term 3 — depleted-absorber in-situ electron (no</w:t>
-      </w:r>
-      <w:r>
-        <w:t xml:space="preserve"> </w:t>
-      </w:r>
-      <m:oMath>
-        <m:sSub>
-          <m:e>
-            <m:r>
-              <m:t>τ</m:t>
-            </m:r>
-          </m:e>
-          <m:sub>
-            <m:r>
-              <m:t>A</m:t>
-            </m:r>
-          </m:sub>
-        </m:sSub>
-      </m:oMath>
-      <w:r>
-        <w:t xml:space="preserve">):</w:t>
-      </w:r>
-    </w:p>
-    <w:p>
-      <w:pPr>
-        <w:pStyle w:val="BodyText"/>
-      </w:pPr>
-      <m:oMathPara>
-        <m:oMathParaPr>
-          <m:jc m:val="center"/>
-        </m:oMathParaPr>
-        <m:oMath>
-          <m:sSub>
-            <m:e>
-              <m:r>
-                <m:t>H</m:t>
-              </m:r>
-            </m:e>
-            <m:sub>
-              <m:r>
-                <m:t>3</m:t>
-              </m:r>
-            </m:sub>
-          </m:sSub>
-          <m:r>
-            <m:rPr>
-              <m:sty m:val="p"/>
-            </m:rPr>
-            <m:t>=</m:t>
-          </m:r>
-          <m:sSub>
-            <m:e>
-              <m:r>
-                <m:t>W</m:t>
-              </m:r>
-            </m:e>
-            <m:sub>
-              <m:r>
-                <m:t>A</m:t>
-              </m:r>
-              <m:r>
-                <m:t>d</m:t>
-              </m:r>
-            </m:sub>
-          </m:sSub>
-          <m:r>
-            <m:t> </m:t>
-          </m:r>
-          <m:r>
-            <m:rPr>
-              <m:sty m:val="p"/>
-            </m:rPr>
-            <m:t>s</m:t>
-          </m:r>
-          <m:r>
-            <m:rPr>
-              <m:sty m:val="p"/>
-            </m:rPr>
-            <m:t>i</m:t>
-          </m:r>
-          <m:r>
-            <m:rPr>
-              <m:sty m:val="p"/>
-            </m:rPr>
-            <m:t>n</m:t>
-          </m:r>
-          <m:r>
-            <m:rPr>
-              <m:sty m:val="p"/>
-            </m:rPr>
-            <m:t>c</m:t>
-          </m:r>
-          <m:r>
-            <m:t>​</m:t>
-          </m:r>
-          <m:d>
-            <m:dPr>
-              <m:begChr m:val="("/>
-              <m:sepChr m:val=""/>
-              <m:endChr m:val=")"/>
-              <m:grow/>
-            </m:dPr>
-            <m:e>
-              <m:f>
-                <m:fPr>
-                  <m:type m:val="bar"/>
-                </m:fPr>
-                <m:num>
-                  <m:r>
-                    <m:t>ω</m:t>
-                  </m:r>
-                  <m:sSub>
-                    <m:e>
-                      <m:r>
-                        <m:t>τ</m:t>
-                      </m:r>
-                    </m:e>
-                    <m:sub>
-                      <m:r>
-                        <m:t>e</m:t>
-                      </m:r>
-                      <m:r>
-                        <m:t>D</m:t>
-                      </m:r>
-                    </m:sub>
-                  </m:sSub>
-                </m:num>
-                <m:den>
-                  <m:r>
-                    <m:t>2</m:t>
-                  </m:r>
-                </m:den>
-              </m:f>
-            </m:e>
-          </m:d>
-          <m:sSup>
-            <m:e>
-              <m:r>
-                <m:t>e</m:t>
-              </m:r>
-            </m:e>
-            <m:sup>
-              <m:r>
-                <m:rPr>
-                  <m:sty m:val="p"/>
-                </m:rPr>
-                <m:t>−</m:t>
-              </m:r>
-              <m:r>
-                <m:t>j</m:t>
-              </m:r>
-              <m:r>
-                <m:t>ω</m:t>
-              </m:r>
-              <m:sSub>
-                <m:e>
-                  <m:r>
-                    <m:t>τ</m:t>
-                  </m:r>
-                </m:e>
-                <m:sub>
-                  <m:r>
-                    <m:t>e</m:t>
-                  </m:r>
-                  <m:r>
-                    <m:t>D</m:t>
-                  </m:r>
-                </m:sub>
-              </m:sSub>
-              <m:r>
-                <m:rPr>
-                  <m:sty m:val="p"/>
-                </m:rPr>
-                <m:t>/</m:t>
-              </m:r>
-              <m:r>
-                <m:t>2</m:t>
-              </m:r>
-            </m:sup>
-          </m:sSup>
-        </m:oMath>
-      </m:oMathPara>
-    </w:p>
-    <w:p>
-      <w:pPr>
-        <w:pStyle w:val="FirstParagraph"/>
-      </w:pPr>
-      <w:r>
-        <w:t xml:space="preserve">Term 4 — depleted-absorber in-situ hole (no</w:t>
-      </w:r>
-      <w:r>
-        <w:t xml:space="preserve"> </w:t>
-      </w:r>
-      <m:oMath>
-        <m:sSub>
-          <m:e>
-            <m:r>
-              <m:t>τ</m:t>
-            </m:r>
-          </m:e>
-          <m:sub>
-            <m:r>
-              <m:t>A</m:t>
-            </m:r>
-          </m:sub>
-        </m:sSub>
-      </m:oMath>
-      <w:r>
-        <w:t xml:space="preserve">):</w:t>
-      </w:r>
-    </w:p>
-    <w:p>
-      <w:pPr>
-        <w:pStyle w:val="BodyText"/>
-      </w:pPr>
-      <m:oMathPara>
-        <m:oMathParaPr>
-          <m:jc m:val="center"/>
-        </m:oMathParaPr>
-        <m:oMath>
-          <m:sSub>
-            <m:e>
-              <m:r>
-                <m:t>H</m:t>
-              </m:r>
-            </m:e>
-            <m:sub>
-              <m:r>
-                <m:t>4</m:t>
-              </m:r>
-            </m:sub>
-          </m:sSub>
-          <m:r>
-            <m:rPr>
-              <m:sty m:val="p"/>
-            </m:rPr>
-            <m:t>=</m:t>
-          </m:r>
-          <m:sSub>
-            <m:e>
-              <m:r>
-                <m:t>W</m:t>
-              </m:r>
-            </m:e>
-            <m:sub>
-              <m:r>
-                <m:t>A</m:t>
-              </m:r>
-              <m:r>
-                <m:t>d</m:t>
-              </m:r>
-            </m:sub>
-          </m:sSub>
-          <m:r>
-            <m:t> </m:t>
-          </m:r>
-          <m:r>
-            <m:rPr>
-              <m:sty m:val="p"/>
-            </m:rPr>
-            <m:t>s</m:t>
-          </m:r>
-          <m:r>
-            <m:rPr>
-              <m:sty m:val="p"/>
-            </m:rPr>
-            <m:t>i</m:t>
-          </m:r>
-          <m:r>
-            <m:rPr>
-              <m:sty m:val="p"/>
-            </m:rPr>
-            <m:t>n</m:t>
-          </m:r>
-          <m:r>
-            <m:rPr>
-              <m:sty m:val="p"/>
-            </m:rPr>
-            <m:t>c</m:t>
-          </m:r>
-          <m:r>
-            <m:t>​</m:t>
-          </m:r>
-          <m:d>
-            <m:dPr>
-              <m:begChr m:val="("/>
-              <m:sepChr m:val=""/>
-              <m:endChr m:val=")"/>
-              <m:grow/>
-            </m:dPr>
-            <m:e>
-              <m:f>
-                <m:fPr>
-                  <m:type m:val="bar"/>
-                </m:fPr>
-                <m:num>
-                  <m:r>
-                    <m:t>ω</m:t>
-                  </m:r>
-                  <m:sSub>
-                    <m:e>
-                      <m:r>
-                        <m:t>τ</m:t>
-                      </m:r>
-                    </m:e>
-                    <m:sub>
-                      <m:r>
-                        <m:t>h</m:t>
-                      </m:r>
-                    </m:sub>
-                  </m:sSub>
-                </m:num>
-                <m:den>
-                  <m:r>
-                    <m:t>2</m:t>
-                  </m:r>
-                </m:den>
-              </m:f>
-            </m:e>
-          </m:d>
-          <m:sSup>
-            <m:e>
-              <m:r>
-                <m:t>e</m:t>
-              </m:r>
-            </m:e>
-            <m:sup>
-              <m:r>
-                <m:rPr>
-                  <m:sty m:val="p"/>
-                </m:rPr>
-                <m:t>−</m:t>
-              </m:r>
-              <m:r>
-                <m:t>j</m:t>
-              </m:r>
-              <m:r>
-                <m:t>ω</m:t>
-              </m:r>
-              <m:sSub>
-                <m:e>
-                  <m:r>
-                    <m:t>τ</m:t>
-                  </m:r>
-                </m:e>
-                <m:sub>
-                  <m:r>
-                    <m:t>h</m:t>
-                  </m:r>
-                </m:sub>
-              </m:sSub>
-              <m:r>
-                <m:rPr>
-                  <m:sty m:val="p"/>
-                </m:rPr>
-                <m:t>/</m:t>
-              </m:r>
-              <m:r>
-                <m:t>2</m:t>
-              </m:r>
-            </m:sup>
-          </m:sSup>
-        </m:oMath>
-      </m:oMathPara>
-    </w:p>
-    <w:p>
-      <w:pPr>
-        <w:pStyle w:val="FirstParagraph"/>
-      </w:pPr>
-      <w:r>
-        <w:t xml:space="preserve">with</w:t>
-      </w:r>
-    </w:p>
-    <w:p>
-      <w:pPr>
-        <w:pStyle w:val="BodyText"/>
-      </w:pPr>
-      <m:oMathPara>
-        <m:oMathParaPr>
-          <m:jc m:val="center"/>
-        </m:oMathParaPr>
-        <m:oMath>
-          <m:sSub>
-            <m:e>
-              <m:r>
-                <m:t>W</m:t>
-              </m:r>
-            </m:e>
-            <m:sub>
-              <m:r>
-                <m:rPr>
-                  <m:sty m:val="p"/>
-                </m:rPr>
-                <m:t>n</m:t>
-              </m:r>
-              <m:r>
-                <m:rPr>
-                  <m:sty m:val="p"/>
-                </m:rPr>
-                <m:t>o</m:t>
-              </m:r>
-              <m:r>
-                <m:rPr>
-                  <m:sty m:val="p"/>
-                </m:rPr>
-                <m:t>r</m:t>
-              </m:r>
-              <m:r>
-                <m:rPr>
-                  <m:sty m:val="p"/>
-                </m:rPr>
-                <m:t>m</m:t>
-              </m:r>
-            </m:sub>
-          </m:sSub>
-          <m:r>
-            <m:rPr>
-              <m:sty m:val="p"/>
-            </m:rPr>
-            <m:t>=</m:t>
-          </m:r>
-          <m:sSub>
-            <m:e>
-              <m:r>
-                <m:t>W</m:t>
-              </m:r>
-            </m:e>
-            <m:sub>
-              <m:r>
-                <m:t>A</m:t>
-              </m:r>
-            </m:sub>
-          </m:sSub>
-          <m:r>
-            <m:rPr>
-              <m:sty m:val="p"/>
-            </m:rPr>
-            <m:t>+</m:t>
-          </m:r>
-          <m:sSub>
-            <m:e>
-              <m:r>
-                <m:t>W</m:t>
-              </m:r>
-            </m:e>
-            <m:sub>
-              <m:r>
-                <m:t>C</m:t>
-              </m:r>
-            </m:sub>
-          </m:sSub>
-          <m:r>
-            <m:rPr>
-              <m:sty m:val="p"/>
-            </m:rPr>
-            <m:t>+</m:t>
-          </m:r>
-          <m:r>
-            <m:t>2</m:t>
-          </m:r>
-          <m:r>
-            <m:t> </m:t>
-          </m:r>
-          <m:sSub>
-            <m:e>
-              <m:r>
-                <m:t>W</m:t>
-              </m:r>
-            </m:e>
-            <m:sub>
-              <m:r>
-                <m:t>A</m:t>
-              </m:r>
-              <m:r>
-                <m:t>d</m:t>
-              </m:r>
-            </m:sub>
-          </m:sSub>
-          <m:r>
-            <m:rPr>
-              <m:sty m:val="p"/>
-            </m:rPr>
-            <m:t>,</m:t>
-          </m:r>
-          <m:r>
-            <m:t>  </m:t>
-          </m:r>
-          <m:r>
-            <m:rPr>
-              <m:sty m:val="p"/>
-            </m:rPr>
-            <m:t>s</m:t>
-          </m:r>
-          <m:r>
-            <m:rPr>
-              <m:sty m:val="p"/>
-            </m:rPr>
-            <m:t>i</m:t>
-          </m:r>
-          <m:r>
-            <m:rPr>
-              <m:sty m:val="p"/>
-            </m:rPr>
-            <m:t>n</m:t>
-          </m:r>
-          <m:r>
-            <m:rPr>
-              <m:sty m:val="p"/>
-            </m:rPr>
-            <m:t>c</m:t>
-          </m:r>
-          <m:r>
-            <m:rPr>
-              <m:sty m:val="p"/>
-            </m:rPr>
-            <m:t>(</m:t>
-          </m:r>
-          <m:r>
-            <m:t>x</m:t>
-          </m:r>
-          <m:r>
-            <m:rPr>
-              <m:sty m:val="p"/>
-            </m:rPr>
-            <m:t>)</m:t>
-          </m:r>
-          <m:r>
-            <m:rPr>
-              <m:sty m:val="p"/>
-            </m:rPr>
-            <m:t>=</m:t>
-          </m:r>
-          <m:f>
-            <m:fPr>
-              <m:type m:val="bar"/>
-            </m:fPr>
-            <m:num>
-              <m:r>
-                <m:rPr>
-                  <m:sty m:val="p"/>
-                </m:rPr>
-                <m:t>sin</m:t>
-              </m:r>
-              <m:r>
-                <m:t>x</m:t>
-              </m:r>
-            </m:num>
-            <m:den>
-              <m:r>
-                <m:t>x</m:t>
-              </m:r>
-            </m:den>
-          </m:f>
-        </m:oMath>
-      </m:oMathPara>
-    </w:p>
     <w:bookmarkEnd w:id="9"/>
-    <w:bookmarkStart w:id="10" w:name="transit-times"/>
+    <w:bookmarkStart w:id="10" w:name="transit-times-and-generation-fractions"/>
     <w:p>
       <w:pPr>
         <w:pStyle w:val="Heading2"/>
       </w:pPr>
       <w:r>
-        <w:t xml:space="preserve">2. Transit times</w:t>
+        <w:t xml:space="preserve">2. Transit times and generation fractions</w:t>
       </w:r>
     </w:p>
     <w:p>
@@ -1252,7 +1764,7 @@
                 </m:e>
                 <m:sub>
                   <m:r>
-                    <m:t>A</m:t>
+                    <m:t>U</m:t>
                   </m:r>
                 </m:sub>
                 <m:sup>
@@ -1385,7 +1897,10 @@
             </m:e>
             <m:sub>
               <m:r>
-                <m:t>C</m:t>
+                <m:t>e</m:t>
+              </m:r>
+              <m:r>
+                <m:t>D</m:t>
               </m:r>
             </m:sub>
           </m:sSub>
@@ -1411,7 +1926,7 @@
                 </m:e>
                 <m:sub>
                   <m:r>
-                    <m:t>C</m:t>
+                    <m:t>D</m:t>
                   </m:r>
                 </m:sub>
               </m:sSub>
@@ -1496,10 +2011,7 @@
             </m:e>
             <m:sub>
               <m:r>
-                <m:t>e</m:t>
-              </m:r>
-              <m:r>
-                <m:t>D</m:t>
+                <m:t>C</m:t>
               </m:r>
             </m:sub>
           </m:sSub>
@@ -1509,66 +2021,90 @@
             </m:rPr>
             <m:t>=</m:t>
           </m:r>
-          <m:sSub>
+          <m:nary>
+            <m:naryPr>
+              <m:chr m:val="∫"/>
+              <m:limLoc m:val="subSup"/>
+              <m:subHide m:val="off"/>
+              <m:supHide m:val="on"/>
+            </m:naryPr>
+            <m:sub>
+              <m:sSub>
+                <m:e>
+                  <m:r>
+                    <m:t>W</m:t>
+                  </m:r>
+                </m:e>
+                <m:sub>
+                  <m:r>
+                    <m:t>C</m:t>
+                  </m:r>
+                </m:sub>
+              </m:sSub>
+            </m:sub>
+            <m:sup>
+              <m:r>
+                <m:t>​</m:t>
+              </m:r>
+            </m:sup>
             <m:e>
-              <m:r>
-                <m:t>τ</m:t>
-              </m:r>
+              <m:f>
+                <m:fPr>
+                  <m:type m:val="bar"/>
+                </m:fPr>
+                <m:num>
+                  <m:r>
+                    <m:t>d</m:t>
+                  </m:r>
+                  <m:r>
+                    <m:t>z</m:t>
+                  </m:r>
+                </m:num>
+                <m:den>
+                  <m:sSub>
+                    <m:e>
+                      <m:r>
+                        <m:t>v</m:t>
+                      </m:r>
+                    </m:e>
+                    <m:sub>
+                      <m:r>
+                        <m:t>e</m:t>
+                      </m:r>
+                    </m:sub>
+                  </m:sSub>
+                  <m:d>
+                    <m:dPr>
+                      <m:begChr m:val="("/>
+                      <m:sepChr m:val=""/>
+                      <m:endChr m:val=")"/>
+                      <m:grow/>
+                    </m:dPr>
+                    <m:e>
+                      <m:r>
+                        <m:t>E</m:t>
+                      </m:r>
+                      <m:r>
+                        <m:rPr>
+                          <m:sty m:val="p"/>
+                        </m:rPr>
+                        <m:t>(</m:t>
+                      </m:r>
+                      <m:r>
+                        <m:t>z</m:t>
+                      </m:r>
+                      <m:r>
+                        <m:rPr>
+                          <m:sty m:val="p"/>
+                        </m:rPr>
+                        <m:t>)</m:t>
+                      </m:r>
+                    </m:e>
+                  </m:d>
+                </m:den>
+              </m:f>
             </m:e>
-            <m:sub>
-              <m:r>
-                <m:t>g</m:t>
-              </m:r>
-              <m:r>
-                <m:t>c</m:t>
-              </m:r>
-              <m:r>
-                <m:t>c</m:t>
-              </m:r>
-            </m:sub>
-          </m:sSub>
-          <m:r>
-            <m:rPr>
-              <m:sty m:val="p"/>
-            </m:rPr>
-            <m:t>+</m:t>
-          </m:r>
-          <m:f>
-            <m:fPr>
-              <m:type m:val="lin"/>
-            </m:fPr>
-            <m:num>
-              <m:r>
-                <m:t>1</m:t>
-              </m:r>
-            </m:num>
-            <m:den>
-              <m:r>
-                <m:t>2</m:t>
-              </m:r>
-            </m:den>
-          </m:f>
-          <m:r>
-            <m:t> </m:t>
-          </m:r>
-          <m:sSub>
-            <m:e>
-              <m:r>
-                <m:t>τ</m:t>
-              </m:r>
-            </m:e>
-            <m:sub>
-              <m:r>
-                <m:t>d</m:t>
-              </m:r>
-              <m:r>
-                <m:t>e</m:t>
-              </m:r>
-              <m:r>
-                <m:t>p</m:t>
-              </m:r>
-            </m:sub>
-          </m:sSub>
+          </m:nary>
         </m:oMath>
       </m:oMathPara>
     </w:p>
@@ -1612,10 +2148,7 @@
                 </m:e>
                 <m:sub>
                   <m:r>
-                    <m:t>A</m:t>
-                  </m:r>
-                  <m:r>
-                    <m:t>d</m:t>
+                    <m:t>D</m:t>
                   </m:r>
                 </m:sub>
               </m:sSub>
@@ -1675,6 +2208,162 @@
               <m:r>
                 <m:t>σ</m:t>
               </m:r>
+            </m:den>
+          </m:f>
+          <m:r>
+            <m:rPr>
+              <m:sty m:val="p"/>
+            </m:rPr>
+            <m:t>,</m:t>
+          </m:r>
+          <m:r>
+            <m:t>  </m:t>
+          </m:r>
+          <m:sSub>
+            <m:e>
+              <m:r>
+                <m:t>η</m:t>
+              </m:r>
+            </m:e>
+            <m:sub>
+              <m:r>
+                <m:t>U</m:t>
+              </m:r>
+            </m:sub>
+          </m:sSub>
+          <m:r>
+            <m:rPr>
+              <m:sty m:val="p"/>
+            </m:rPr>
+            <m:t>=</m:t>
+          </m:r>
+          <m:f>
+            <m:fPr>
+              <m:type m:val="bar"/>
+            </m:fPr>
+            <m:num>
+              <m:sSub>
+                <m:e>
+                  <m:r>
+                    <m:t>A</m:t>
+                  </m:r>
+                </m:e>
+                <m:sub>
+                  <m:r>
+                    <m:t>U</m:t>
+                  </m:r>
+                </m:sub>
+              </m:sSub>
+            </m:num>
+            <m:den>
+              <m:sSub>
+                <m:e>
+                  <m:r>
+                    <m:t>A</m:t>
+                  </m:r>
+                </m:e>
+                <m:sub>
+                  <m:r>
+                    <m:t>U</m:t>
+                  </m:r>
+                </m:sub>
+              </m:sSub>
+              <m:r>
+                <m:rPr>
+                  <m:sty m:val="p"/>
+                </m:rPr>
+                <m:t>+</m:t>
+              </m:r>
+              <m:sSub>
+                <m:e>
+                  <m:r>
+                    <m:t>A</m:t>
+                  </m:r>
+                </m:e>
+                <m:sub>
+                  <m:r>
+                    <m:t>D</m:t>
+                  </m:r>
+                </m:sub>
+              </m:sSub>
+            </m:den>
+          </m:f>
+          <m:r>
+            <m:rPr>
+              <m:sty m:val="p"/>
+            </m:rPr>
+            <m:t>,</m:t>
+          </m:r>
+          <m:r>
+            <m:t> </m:t>
+          </m:r>
+          <m:sSub>
+            <m:e>
+              <m:r>
+                <m:t>η</m:t>
+              </m:r>
+            </m:e>
+            <m:sub>
+              <m:r>
+                <m:t>D</m:t>
+              </m:r>
+            </m:sub>
+          </m:sSub>
+          <m:r>
+            <m:rPr>
+              <m:sty m:val="p"/>
+            </m:rPr>
+            <m:t>=</m:t>
+          </m:r>
+          <m:f>
+            <m:fPr>
+              <m:type m:val="bar"/>
+            </m:fPr>
+            <m:num>
+              <m:sSub>
+                <m:e>
+                  <m:r>
+                    <m:t>A</m:t>
+                  </m:r>
+                </m:e>
+                <m:sub>
+                  <m:r>
+                    <m:t>D</m:t>
+                  </m:r>
+                </m:sub>
+              </m:sSub>
+            </m:num>
+            <m:den>
+              <m:sSub>
+                <m:e>
+                  <m:r>
+                    <m:t>A</m:t>
+                  </m:r>
+                </m:e>
+                <m:sub>
+                  <m:r>
+                    <m:t>U</m:t>
+                  </m:r>
+                </m:sub>
+              </m:sSub>
+              <m:r>
+                <m:rPr>
+                  <m:sty m:val="p"/>
+                </m:rPr>
+                <m:t>+</m:t>
+              </m:r>
+              <m:sSub>
+                <m:e>
+                  <m:r>
+                    <m:t>A</m:t>
+                  </m:r>
+                </m:e>
+                <m:sub>
+                  <m:r>
+                    <m:t>D</m:t>
+                  </m:r>
+                </m:sub>
+              </m:sSub>
             </m:den>
           </m:f>
         </m:oMath>

</xml_diff>

<commit_message>
Correct H_MUTC parameters per reference (saturation-velocity transit, uniform-gen eta)
Updates to match the authoritative reference values:
  - W_D 160 -> 240 nm, W_C 820 -> 740 nm (W_T=1460 unchanged)
  - Transit times now W/v_sat (not v(E) integrals):
    tau_eD 1.143 ps, tau_C 1.850 ps, tau_h 9.60 ps (v_h,sat=2.5e4 m/s)
  - eta from uniform optical generation: eta_U=W_U/(W_U+W_D)=0.6667, eta_D=0.3333
    (replaces Beer-Lambert; QE=0.56 sets only absolute scale, not normalized shape)
  - tau_R neglected in bandwidth calculation
Applied to both -7V and -5V scripts. DC normalizes to 1. S11 fits unchanged.
Transit-limited f_tr 31.53 -> 45.91 GHz. Equations doc regenerated.

Co-Authored-By: Claude Opus 4.8 <noreply@anthropic.com>
Claude-Session: https://claude.ai/code/session_01Ai2cJaAR1a4hKpeYKcLV7K
</commit_message>
<xml_diff>
--- a/UTC_PD_equations.docx
+++ b/UTC_PD_equations.docx
@@ -1728,6 +1728,306 @@
       <w:pPr>
         <w:pStyle w:val="FirstParagraph"/>
       </w:pPr>
+      <w:r>
+        <w:t xml:space="preserve">Transit times from saturation-velocity crossing:</w:t>
+      </w:r>
+    </w:p>
+    <w:p>
+      <w:pPr>
+        <w:pStyle w:val="BodyText"/>
+      </w:pPr>
+      <m:oMathPara>
+        <m:oMathParaPr>
+          <m:jc m:val="center"/>
+        </m:oMathParaPr>
+        <m:oMath>
+          <m:sSub>
+            <m:e>
+              <m:r>
+                <m:t>τ</m:t>
+              </m:r>
+            </m:e>
+            <m:sub>
+              <m:r>
+                <m:t>e</m:t>
+              </m:r>
+              <m:r>
+                <m:t>D</m:t>
+              </m:r>
+            </m:sub>
+          </m:sSub>
+          <m:r>
+            <m:rPr>
+              <m:sty m:val="p"/>
+            </m:rPr>
+            <m:t>=</m:t>
+          </m:r>
+          <m:f>
+            <m:fPr>
+              <m:type m:val="bar"/>
+            </m:fPr>
+            <m:num>
+              <m:sSub>
+                <m:e>
+                  <m:r>
+                    <m:t>W</m:t>
+                  </m:r>
+                </m:e>
+                <m:sub>
+                  <m:r>
+                    <m:t>D</m:t>
+                  </m:r>
+                </m:sub>
+              </m:sSub>
+            </m:num>
+            <m:den>
+              <m:sSub>
+                <m:e>
+                  <m:r>
+                    <m:t>v</m:t>
+                  </m:r>
+                </m:e>
+                <m:sub>
+                  <m:r>
+                    <m:t>e</m:t>
+                  </m:r>
+                  <m:r>
+                    <m:t>D</m:t>
+                  </m:r>
+                  <m:r>
+                    <m:rPr>
+                      <m:sty m:val="p"/>
+                    </m:rPr>
+                    <m:t>,</m:t>
+                  </m:r>
+                  <m:r>
+                    <m:rPr>
+                      <m:sty m:val="p"/>
+                    </m:rPr>
+                    <m:t>s</m:t>
+                  </m:r>
+                  <m:r>
+                    <m:rPr>
+                      <m:sty m:val="p"/>
+                    </m:rPr>
+                    <m:t>a</m:t>
+                  </m:r>
+                  <m:r>
+                    <m:rPr>
+                      <m:sty m:val="p"/>
+                    </m:rPr>
+                    <m:t>t</m:t>
+                  </m:r>
+                </m:sub>
+              </m:sSub>
+            </m:den>
+          </m:f>
+          <m:r>
+            <m:rPr>
+              <m:sty m:val="p"/>
+            </m:rPr>
+            <m:t>,</m:t>
+          </m:r>
+          <m:r>
+            <m:t>  </m:t>
+          </m:r>
+          <m:sSub>
+            <m:e>
+              <m:r>
+                <m:t>τ</m:t>
+              </m:r>
+            </m:e>
+            <m:sub>
+              <m:r>
+                <m:t>h</m:t>
+              </m:r>
+            </m:sub>
+          </m:sSub>
+          <m:r>
+            <m:rPr>
+              <m:sty m:val="p"/>
+            </m:rPr>
+            <m:t>=</m:t>
+          </m:r>
+          <m:f>
+            <m:fPr>
+              <m:type m:val="bar"/>
+            </m:fPr>
+            <m:num>
+              <m:sSub>
+                <m:e>
+                  <m:r>
+                    <m:t>W</m:t>
+                  </m:r>
+                </m:e>
+                <m:sub>
+                  <m:r>
+                    <m:t>D</m:t>
+                  </m:r>
+                </m:sub>
+              </m:sSub>
+            </m:num>
+            <m:den>
+              <m:sSub>
+                <m:e>
+                  <m:r>
+                    <m:t>v</m:t>
+                  </m:r>
+                </m:e>
+                <m:sub>
+                  <m:r>
+                    <m:t>h</m:t>
+                  </m:r>
+                  <m:r>
+                    <m:rPr>
+                      <m:sty m:val="p"/>
+                    </m:rPr>
+                    <m:t>,</m:t>
+                  </m:r>
+                  <m:r>
+                    <m:rPr>
+                      <m:sty m:val="p"/>
+                    </m:rPr>
+                    <m:t>s</m:t>
+                  </m:r>
+                  <m:r>
+                    <m:rPr>
+                      <m:sty m:val="p"/>
+                    </m:rPr>
+                    <m:t>a</m:t>
+                  </m:r>
+                  <m:r>
+                    <m:rPr>
+                      <m:sty m:val="p"/>
+                    </m:rPr>
+                    <m:t>t</m:t>
+                  </m:r>
+                </m:sub>
+              </m:sSub>
+            </m:den>
+          </m:f>
+          <m:r>
+            <m:rPr>
+              <m:sty m:val="p"/>
+            </m:rPr>
+            <m:t>,</m:t>
+          </m:r>
+          <m:r>
+            <m:t>  </m:t>
+          </m:r>
+          <m:sSub>
+            <m:e>
+              <m:r>
+                <m:t>τ</m:t>
+              </m:r>
+            </m:e>
+            <m:sub>
+              <m:r>
+                <m:t>C</m:t>
+              </m:r>
+            </m:sub>
+          </m:sSub>
+          <m:r>
+            <m:rPr>
+              <m:sty m:val="p"/>
+            </m:rPr>
+            <m:t>=</m:t>
+          </m:r>
+          <m:f>
+            <m:fPr>
+              <m:type m:val="bar"/>
+            </m:fPr>
+            <m:num>
+              <m:sSub>
+                <m:e>
+                  <m:r>
+                    <m:t>W</m:t>
+                  </m:r>
+                </m:e>
+                <m:sub>
+                  <m:r>
+                    <m:t>C</m:t>
+                  </m:r>
+                </m:sub>
+              </m:sSub>
+            </m:num>
+            <m:den>
+              <m:sSub>
+                <m:e>
+                  <m:r>
+                    <m:t>v</m:t>
+                  </m:r>
+                </m:e>
+                <m:sub>
+                  <m:r>
+                    <m:t>C</m:t>
+                  </m:r>
+                  <m:r>
+                    <m:rPr>
+                      <m:sty m:val="p"/>
+                    </m:rPr>
+                    <m:t>,</m:t>
+                  </m:r>
+                  <m:r>
+                    <m:rPr>
+                      <m:sty m:val="p"/>
+                    </m:rPr>
+                    <m:t>s</m:t>
+                  </m:r>
+                  <m:r>
+                    <m:rPr>
+                      <m:sty m:val="p"/>
+                    </m:rPr>
+                    <m:t>a</m:t>
+                  </m:r>
+                  <m:r>
+                    <m:rPr>
+                      <m:sty m:val="p"/>
+                    </m:rPr>
+                    <m:t>t</m:t>
+                  </m:r>
+                </m:sub>
+              </m:sSub>
+            </m:den>
+          </m:f>
+        </m:oMath>
+      </m:oMathPara>
+    </w:p>
+    <w:p>
+      <w:pPr>
+        <w:pStyle w:val="FirstParagraph"/>
+      </w:pPr>
+      <w:r>
+        <w:t xml:space="preserve">Undepleted-absorber effective transit (diffusion + quasi-field);</w:t>
+      </w:r>
+      <w:r>
+        <w:t xml:space="preserve"> </w:t>
+      </w:r>
+      <m:oMath>
+        <m:sSub>
+          <m:e>
+            <m:r>
+              <m:t>τ</m:t>
+            </m:r>
+          </m:e>
+          <m:sub>
+            <m:r>
+              <m:t>R</m:t>
+            </m:r>
+          </m:sub>
+        </m:sSub>
+      </m:oMath>
+      <w:r>
+        <w:t xml:space="preserve"> </w:t>
+      </w:r>
+      <w:r>
+        <w:t xml:space="preserve">is neglected in the bandwidth calculation:</w:t>
+      </w:r>
+    </w:p>
+    <w:p>
+      <w:pPr>
+        <w:pStyle w:val="BodyText"/>
+      </w:pPr>
       <m:oMathPara>
         <m:oMathParaPr>
           <m:jc m:val="center"/>
@@ -1880,237 +2180,20 @@
               </m:d>
             </m:den>
           </m:f>
-          <m:r>
-            <m:rPr>
-              <m:sty m:val="p"/>
-            </m:rPr>
-            <m:t>,</m:t>
-          </m:r>
-          <m:r>
-            <m:t>  </m:t>
-          </m:r>
-          <m:sSub>
-            <m:e>
-              <m:r>
-                <m:t>τ</m:t>
-              </m:r>
-            </m:e>
-            <m:sub>
-              <m:r>
-                <m:t>e</m:t>
-              </m:r>
-              <m:r>
-                <m:t>D</m:t>
-              </m:r>
-            </m:sub>
-          </m:sSub>
-          <m:r>
-            <m:rPr>
-              <m:sty m:val="p"/>
-            </m:rPr>
-            <m:t>=</m:t>
-          </m:r>
-          <m:nary>
-            <m:naryPr>
-              <m:chr m:val="∫"/>
-              <m:limLoc m:val="subSup"/>
-              <m:subHide m:val="off"/>
-              <m:supHide m:val="on"/>
-            </m:naryPr>
-            <m:sub>
-              <m:sSub>
-                <m:e>
-                  <m:r>
-                    <m:t>W</m:t>
-                  </m:r>
-                </m:e>
-                <m:sub>
-                  <m:r>
-                    <m:t>D</m:t>
-                  </m:r>
-                </m:sub>
-              </m:sSub>
-            </m:sub>
-            <m:sup>
-              <m:r>
-                <m:t>​</m:t>
-              </m:r>
-            </m:sup>
-            <m:e>
-              <m:f>
-                <m:fPr>
-                  <m:type m:val="bar"/>
-                </m:fPr>
-                <m:num>
-                  <m:r>
-                    <m:t>d</m:t>
-                  </m:r>
-                  <m:r>
-                    <m:t>z</m:t>
-                  </m:r>
-                </m:num>
-                <m:den>
-                  <m:sSub>
-                    <m:e>
-                      <m:r>
-                        <m:t>v</m:t>
-                      </m:r>
-                    </m:e>
-                    <m:sub>
-                      <m:r>
-                        <m:t>e</m:t>
-                      </m:r>
-                    </m:sub>
-                  </m:sSub>
-                  <m:d>
-                    <m:dPr>
-                      <m:begChr m:val="("/>
-                      <m:sepChr m:val=""/>
-                      <m:endChr m:val=")"/>
-                      <m:grow/>
-                    </m:dPr>
-                    <m:e>
-                      <m:r>
-                        <m:t>E</m:t>
-                      </m:r>
-                      <m:r>
-                        <m:rPr>
-                          <m:sty m:val="p"/>
-                        </m:rPr>
-                        <m:t>(</m:t>
-                      </m:r>
-                      <m:r>
-                        <m:t>z</m:t>
-                      </m:r>
-                      <m:r>
-                        <m:rPr>
-                          <m:sty m:val="p"/>
-                        </m:rPr>
-                        <m:t>)</m:t>
-                      </m:r>
-                    </m:e>
-                  </m:d>
-                </m:den>
-              </m:f>
-            </m:e>
-          </m:nary>
-          <m:r>
-            <m:rPr>
-              <m:sty m:val="p"/>
-            </m:rPr>
-            <m:t>,</m:t>
-          </m:r>
-          <m:r>
-            <m:t>  </m:t>
-          </m:r>
-          <m:sSub>
-            <m:e>
-              <m:r>
-                <m:t>τ</m:t>
-              </m:r>
-            </m:e>
-            <m:sub>
-              <m:r>
-                <m:t>C</m:t>
-              </m:r>
-            </m:sub>
-          </m:sSub>
-          <m:r>
-            <m:rPr>
-              <m:sty m:val="p"/>
-            </m:rPr>
-            <m:t>=</m:t>
-          </m:r>
-          <m:nary>
-            <m:naryPr>
-              <m:chr m:val="∫"/>
-              <m:limLoc m:val="subSup"/>
-              <m:subHide m:val="off"/>
-              <m:supHide m:val="on"/>
-            </m:naryPr>
-            <m:sub>
-              <m:sSub>
-                <m:e>
-                  <m:r>
-                    <m:t>W</m:t>
-                  </m:r>
-                </m:e>
-                <m:sub>
-                  <m:r>
-                    <m:t>C</m:t>
-                  </m:r>
-                </m:sub>
-              </m:sSub>
-            </m:sub>
-            <m:sup>
-              <m:r>
-                <m:t>​</m:t>
-              </m:r>
-            </m:sup>
-            <m:e>
-              <m:f>
-                <m:fPr>
-                  <m:type m:val="bar"/>
-                </m:fPr>
-                <m:num>
-                  <m:r>
-                    <m:t>d</m:t>
-                  </m:r>
-                  <m:r>
-                    <m:t>z</m:t>
-                  </m:r>
-                </m:num>
-                <m:den>
-                  <m:sSub>
-                    <m:e>
-                      <m:r>
-                        <m:t>v</m:t>
-                      </m:r>
-                    </m:e>
-                    <m:sub>
-                      <m:r>
-                        <m:t>e</m:t>
-                      </m:r>
-                    </m:sub>
-                  </m:sSub>
-                  <m:d>
-                    <m:dPr>
-                      <m:begChr m:val="("/>
-                      <m:sepChr m:val=""/>
-                      <m:endChr m:val=")"/>
-                      <m:grow/>
-                    </m:dPr>
-                    <m:e>
-                      <m:r>
-                        <m:t>E</m:t>
-                      </m:r>
-                      <m:r>
-                        <m:rPr>
-                          <m:sty m:val="p"/>
-                        </m:rPr>
-                        <m:t>(</m:t>
-                      </m:r>
-                      <m:r>
-                        <m:t>z</m:t>
-                      </m:r>
-                      <m:r>
-                        <m:rPr>
-                          <m:sty m:val="p"/>
-                        </m:rPr>
-                        <m:t>)</m:t>
-                      </m:r>
-                    </m:e>
-                  </m:d>
-                </m:den>
-              </m:f>
-            </m:e>
-          </m:nary>
         </m:oMath>
       </m:oMathPara>
     </w:p>
     <w:p>
       <w:pPr>
         <w:pStyle w:val="FirstParagraph"/>
+      </w:pPr>
+      <w:r>
+        <w:t xml:space="preserve">Generation fractions (uniform optical generation over the absorbers):</w:t>
+      </w:r>
+    </w:p>
+    <w:p>
+      <w:pPr>
+        <w:pStyle w:val="BodyText"/>
       </w:pPr>
       <m:oMathPara>
         <m:oMathParaPr>
@@ -2120,12 +2203,12 @@
           <m:sSub>
             <m:e>
               <m:r>
-                <m:t>τ</m:t>
+                <m:t>η</m:t>
               </m:r>
             </m:e>
             <m:sub>
               <m:r>
-                <m:t>h</m:t>
+                <m:t>U</m:t>
               </m:r>
             </m:sub>
           </m:sSub>
@@ -2148,7 +2231,7 @@
                 </m:e>
                 <m:sub>
                   <m:r>
-                    <m:t>D</m:t>
+                    <m:t>U</m:t>
                   </m:r>
                 </m:sub>
               </m:sSub>
@@ -2157,12 +2240,30 @@
               <m:sSub>
                 <m:e>
                   <m:r>
-                    <m:t>v</m:t>
+                    <m:t>W</m:t>
                   </m:r>
                 </m:e>
                 <m:sub>
                   <m:r>
-                    <m:t>h</m:t>
+                    <m:t>U</m:t>
+                  </m:r>
+                </m:sub>
+              </m:sSub>
+              <m:r>
+                <m:rPr>
+                  <m:sty m:val="p"/>
+                </m:rPr>
+                <m:t>+</m:t>
+              </m:r>
+              <m:sSub>
+                <m:e>
+                  <m:r>
+                    <m:t>W</m:t>
+                  </m:r>
+                </m:e>
+                <m:sub>
+                  <m:r>
+                    <m:t>D</m:t>
                   </m:r>
                 </m:sub>
               </m:sSub>
@@ -2180,54 +2281,12 @@
           <m:sSub>
             <m:e>
               <m:r>
-                <m:t>τ</m:t>
+                <m:t>η</m:t>
               </m:r>
             </m:e>
             <m:sub>
               <m:r>
-                <m:t>R</m:t>
-              </m:r>
-            </m:sub>
-          </m:sSub>
-          <m:r>
-            <m:rPr>
-              <m:sty m:val="p"/>
-            </m:rPr>
-            <m:t>=</m:t>
-          </m:r>
-          <m:f>
-            <m:fPr>
-              <m:type m:val="bar"/>
-            </m:fPr>
-            <m:num>
-              <m:r>
-                <m:t>ε</m:t>
-              </m:r>
-            </m:num>
-            <m:den>
-              <m:r>
-                <m:t>σ</m:t>
-              </m:r>
-            </m:den>
-          </m:f>
-          <m:r>
-            <m:rPr>
-              <m:sty m:val="p"/>
-            </m:rPr>
-            <m:t>,</m:t>
-          </m:r>
-          <m:r>
-            <m:t>  </m:t>
-          </m:r>
-          <m:sSub>
-            <m:e>
-              <m:r>
-                <m:t>η</m:t>
-              </m:r>
-            </m:e>
-            <m:sub>
-              <m:r>
-                <m:t>U</m:t>
+                <m:t>D</m:t>
               </m:r>
             </m:sub>
           </m:sSub>
@@ -2245,12 +2304,12 @@
               <m:sSub>
                 <m:e>
                   <m:r>
-                    <m:t>A</m:t>
+                    <m:t>W</m:t>
                   </m:r>
                 </m:e>
                 <m:sub>
                   <m:r>
-                    <m:t>U</m:t>
+                    <m:t>D</m:t>
                   </m:r>
                 </m:sub>
               </m:sSub>
@@ -2259,7 +2318,7 @@
               <m:sSub>
                 <m:e>
                   <m:r>
-                    <m:t>A</m:t>
+                    <m:t>W</m:t>
                   </m:r>
                 </m:e>
                 <m:sub>
@@ -2277,85 +2336,7 @@
               <m:sSub>
                 <m:e>
                   <m:r>
-                    <m:t>A</m:t>
-                  </m:r>
-                </m:e>
-                <m:sub>
-                  <m:r>
-                    <m:t>D</m:t>
-                  </m:r>
-                </m:sub>
-              </m:sSub>
-            </m:den>
-          </m:f>
-          <m:r>
-            <m:rPr>
-              <m:sty m:val="p"/>
-            </m:rPr>
-            <m:t>,</m:t>
-          </m:r>
-          <m:r>
-            <m:t> </m:t>
-          </m:r>
-          <m:sSub>
-            <m:e>
-              <m:r>
-                <m:t>η</m:t>
-              </m:r>
-            </m:e>
-            <m:sub>
-              <m:r>
-                <m:t>D</m:t>
-              </m:r>
-            </m:sub>
-          </m:sSub>
-          <m:r>
-            <m:rPr>
-              <m:sty m:val="p"/>
-            </m:rPr>
-            <m:t>=</m:t>
-          </m:r>
-          <m:f>
-            <m:fPr>
-              <m:type m:val="bar"/>
-            </m:fPr>
-            <m:num>
-              <m:sSub>
-                <m:e>
-                  <m:r>
-                    <m:t>A</m:t>
-                  </m:r>
-                </m:e>
-                <m:sub>
-                  <m:r>
-                    <m:t>D</m:t>
-                  </m:r>
-                </m:sub>
-              </m:sSub>
-            </m:num>
-            <m:den>
-              <m:sSub>
-                <m:e>
-                  <m:r>
-                    <m:t>A</m:t>
-                  </m:r>
-                </m:e>
-                <m:sub>
-                  <m:r>
-                    <m:t>U</m:t>
-                  </m:r>
-                </m:sub>
-              </m:sSub>
-              <m:r>
-                <m:rPr>
-                  <m:sty m:val="p"/>
-                </m:rPr>
-                <m:t>+</m:t>
-              </m:r>
-              <m:sSub>
-                <m:e>
-                  <m:r>
-                    <m:t>A</m:t>
+                    <m:t>W</m:t>
                   </m:r>
                 </m:e>
                 <m:sub>

</xml_diff>